<commit_message>
Added me the readme file and the Trend Application setup file
</commit_message>
<xml_diff>
--- a/trend-application-setup.docx
+++ b/trend-application-setup.docx
@@ -313,7 +313,7 @@
       <w:r>
         <w:rPr/>
         <w:drawing>
-          <wp:anchor behindDoc="0" distT="0" distB="0" distL="0" distR="0" simplePos="0" locked="0" layoutInCell="0" allowOverlap="1" relativeHeight="11">
+          <wp:anchor behindDoc="0" distT="0" distB="0" distL="0" distR="0" simplePos="0" locked="0" layoutInCell="0" allowOverlap="1" relativeHeight="10">
             <wp:simplePos x="0" y="0"/>
             <wp:positionH relativeFrom="column">
               <wp:posOffset>-29845</wp:posOffset>
@@ -711,7 +711,7 @@
       <w:r>
         <w:rPr/>
         <w:drawing>
-          <wp:anchor behindDoc="0" distT="0" distB="0" distL="0" distR="0" simplePos="0" locked="0" layoutInCell="0" allowOverlap="1" relativeHeight="10">
+          <wp:anchor behindDoc="0" distT="0" distB="0" distL="0" distR="0" simplePos="0" locked="0" layoutInCell="0" allowOverlap="1" relativeHeight="9">
             <wp:simplePos x="0" y="0"/>
             <wp:positionH relativeFrom="column">
               <wp:posOffset>80645</wp:posOffset>
@@ -2094,7 +2094,7 @@
       </w:pPr>
       <w:r>
         <w:rPr/>
-        <w:t>This Screenshot is for showing that EKS cluster is created using the eksctl command</w:t>
+        <w:t>User Script for creation of jenkins and all the other necessary packages. This is in the main.tf file</w:t>
       </w:r>
     </w:p>
     <w:p>
@@ -2118,18 +2118,18 @@
       <w:r>
         <w:rPr/>
         <w:drawing>
-          <wp:anchor behindDoc="0" distT="0" distB="0" distL="0" distR="0" simplePos="0" locked="0" layoutInCell="0" allowOverlap="1" relativeHeight="9">
+          <wp:anchor behindDoc="0" distT="0" distB="0" distL="0" distR="0" simplePos="0" locked="0" layoutInCell="0" allowOverlap="1" relativeHeight="11">
             <wp:simplePos x="0" y="0"/>
             <wp:positionH relativeFrom="column">
-              <wp:posOffset>80010</wp:posOffset>
+              <wp:align>center</wp:align>
             </wp:positionH>
             <wp:positionV relativeFrom="paragraph">
-              <wp:posOffset>13970</wp:posOffset>
+              <wp:posOffset>635</wp:posOffset>
             </wp:positionV>
-            <wp:extent cx="4086225" cy="2225675"/>
+            <wp:extent cx="5953125" cy="2807970"/>
             <wp:effectExtent l="0" t="0" r="0" b="0"/>
             <wp:wrapSquare wrapText="largest"/>
-            <wp:docPr id="9" name="Image9" descr="" title=""/>
+            <wp:docPr id="9" name="Image11" descr="" title=""/>
             <wp:cNvGraphicFramePr>
               <a:graphicFrameLocks xmlns:a="http://schemas.openxmlformats.org/drawingml/2006/main" noChangeAspect="1"/>
             </wp:cNvGraphicFramePr>
@@ -2137,13 +2137,313 @@
               <a:graphicData uri="http://schemas.openxmlformats.org/drawingml/2006/picture">
                 <pic:pic xmlns:pic="http://schemas.openxmlformats.org/drawingml/2006/picture">
                   <pic:nvPicPr>
-                    <pic:cNvPr id="9" name="Image9" descr="" title=""/>
+                    <pic:cNvPr id="9" name="Image11" descr="" title=""/>
                     <pic:cNvPicPr>
                       <a:picLocks noChangeAspect="1" noChangeArrowheads="1"/>
                     </pic:cNvPicPr>
                   </pic:nvPicPr>
                   <pic:blipFill>
                     <a:blip r:embed="rId10"/>
+                    <a:stretch>
+                      <a:fillRect/>
+                    </a:stretch>
+                  </pic:blipFill>
+                  <pic:spPr bwMode="auto">
+                    <a:xfrm>
+                      <a:off x="0" y="0"/>
+                      <a:ext cx="5953125" cy="2807970"/>
+                    </a:xfrm>
+                    <a:prstGeom prst="rect">
+                      <a:avLst/>
+                    </a:prstGeom>
+                  </pic:spPr>
+                </pic:pic>
+              </a:graphicData>
+            </a:graphic>
+          </wp:anchor>
+        </w:drawing>
+      </w:r>
+    </w:p>
+    <w:p>
+      <w:pPr>
+        <w:pStyle w:val="Normal"/>
+        <w:bidi w:val="0"/>
+        <w:jc w:val="start"/>
+        <w:rPr/>
+      </w:pPr>
+      <w:r>
+        <w:rPr/>
+      </w:r>
+    </w:p>
+    <w:p>
+      <w:pPr>
+        <w:pStyle w:val="Normal"/>
+        <w:bidi w:val="0"/>
+        <w:jc w:val="start"/>
+        <w:rPr/>
+      </w:pPr>
+      <w:r>
+        <w:rPr/>
+      </w:r>
+    </w:p>
+    <w:p>
+      <w:pPr>
+        <w:pStyle w:val="Normal"/>
+        <w:bidi w:val="0"/>
+        <w:jc w:val="start"/>
+        <w:rPr/>
+      </w:pPr>
+      <w:r>
+        <w:rPr/>
+      </w:r>
+    </w:p>
+    <w:p>
+      <w:pPr>
+        <w:pStyle w:val="Normal"/>
+        <w:bidi w:val="0"/>
+        <w:jc w:val="start"/>
+        <w:rPr/>
+      </w:pPr>
+      <w:r>
+        <w:rPr/>
+        <w:t>This Screenshot is for showing that EKS cluster is created using the eksctl command</w:t>
+      </w:r>
+    </w:p>
+    <w:p>
+      <w:pPr>
+        <w:pStyle w:val="Normal"/>
+        <w:bidi w:val="0"/>
+        <w:jc w:val="start"/>
+        <w:rPr/>
+      </w:pPr>
+      <w:r>
+        <w:rPr/>
+        <w:drawing>
+          <wp:anchor behindDoc="0" distT="0" distB="0" distL="0" distR="0" simplePos="0" locked="0" layoutInCell="0" allowOverlap="1" relativeHeight="12">
+            <wp:simplePos x="0" y="0"/>
+            <wp:positionH relativeFrom="column">
+              <wp:posOffset>25400</wp:posOffset>
+            </wp:positionH>
+            <wp:positionV relativeFrom="paragraph">
+              <wp:posOffset>131445</wp:posOffset>
+            </wp:positionV>
+            <wp:extent cx="4882515" cy="2007235"/>
+            <wp:effectExtent l="0" t="0" r="0" b="0"/>
+            <wp:wrapSquare wrapText="largest"/>
+            <wp:docPr id="10" name="Image12" descr="" title=""/>
+            <wp:cNvGraphicFramePr>
+              <a:graphicFrameLocks xmlns:a="http://schemas.openxmlformats.org/drawingml/2006/main" noChangeAspect="1"/>
+            </wp:cNvGraphicFramePr>
+            <a:graphic xmlns:a="http://schemas.openxmlformats.org/drawingml/2006/main">
+              <a:graphicData uri="http://schemas.openxmlformats.org/drawingml/2006/picture">
+                <pic:pic xmlns:pic="http://schemas.openxmlformats.org/drawingml/2006/picture">
+                  <pic:nvPicPr>
+                    <pic:cNvPr id="10" name="Image12" descr="" title=""/>
+                    <pic:cNvPicPr>
+                      <a:picLocks noChangeAspect="1" noChangeArrowheads="1"/>
+                    </pic:cNvPicPr>
+                  </pic:nvPicPr>
+                  <pic:blipFill>
+                    <a:blip r:embed="rId11"/>
+                    <a:stretch>
+                      <a:fillRect/>
+                    </a:stretch>
+                  </pic:blipFill>
+                  <pic:spPr bwMode="auto">
+                    <a:xfrm>
+                      <a:off x="0" y="0"/>
+                      <a:ext cx="4882515" cy="2007235"/>
+                    </a:xfrm>
+                    <a:prstGeom prst="rect">
+                      <a:avLst/>
+                    </a:prstGeom>
+                  </pic:spPr>
+                </pic:pic>
+              </a:graphicData>
+            </a:graphic>
+          </wp:anchor>
+        </w:drawing>
+      </w:r>
+    </w:p>
+    <w:p>
+      <w:pPr>
+        <w:pStyle w:val="Normal"/>
+        <w:bidi w:val="0"/>
+        <w:jc w:val="start"/>
+        <w:rPr/>
+      </w:pPr>
+      <w:r>
+        <w:rPr/>
+      </w:r>
+    </w:p>
+    <w:p>
+      <w:pPr>
+        <w:pStyle w:val="Normal"/>
+        <w:bidi w:val="0"/>
+        <w:jc w:val="start"/>
+        <w:rPr/>
+      </w:pPr>
+      <w:r>
+        <w:rPr/>
+      </w:r>
+    </w:p>
+    <w:p>
+      <w:pPr>
+        <w:pStyle w:val="Normal"/>
+        <w:bidi w:val="0"/>
+        <w:jc w:val="start"/>
+        <w:rPr/>
+      </w:pPr>
+      <w:r>
+        <w:rPr/>
+      </w:r>
+    </w:p>
+    <w:p>
+      <w:pPr>
+        <w:pStyle w:val="Normal"/>
+        <w:bidi w:val="0"/>
+        <w:jc w:val="start"/>
+        <w:rPr/>
+      </w:pPr>
+      <w:r>
+        <w:rPr/>
+      </w:r>
+    </w:p>
+    <w:p>
+      <w:pPr>
+        <w:pStyle w:val="Normal"/>
+        <w:bidi w:val="0"/>
+        <w:jc w:val="start"/>
+        <w:rPr/>
+      </w:pPr>
+      <w:r>
+        <w:rPr/>
+      </w:r>
+    </w:p>
+    <w:p>
+      <w:pPr>
+        <w:pStyle w:val="Normal"/>
+        <w:bidi w:val="0"/>
+        <w:jc w:val="start"/>
+        <w:rPr/>
+      </w:pPr>
+      <w:r>
+        <w:rPr/>
+      </w:r>
+    </w:p>
+    <w:p>
+      <w:pPr>
+        <w:pStyle w:val="Normal"/>
+        <w:bidi w:val="0"/>
+        <w:jc w:val="start"/>
+        <w:rPr/>
+      </w:pPr>
+      <w:r>
+        <w:rPr/>
+      </w:r>
+    </w:p>
+    <w:p>
+      <w:pPr>
+        <w:pStyle w:val="Normal"/>
+        <w:bidi w:val="0"/>
+        <w:jc w:val="start"/>
+        <w:rPr/>
+      </w:pPr>
+      <w:r>
+        <w:rPr/>
+      </w:r>
+    </w:p>
+    <w:p>
+      <w:pPr>
+        <w:pStyle w:val="Normal"/>
+        <w:bidi w:val="0"/>
+        <w:jc w:val="start"/>
+        <w:rPr/>
+      </w:pPr>
+      <w:r>
+        <w:rPr/>
+      </w:r>
+    </w:p>
+    <w:p>
+      <w:pPr>
+        <w:pStyle w:val="Normal"/>
+        <w:bidi w:val="0"/>
+        <w:jc w:val="start"/>
+        <w:rPr/>
+      </w:pPr>
+      <w:r>
+        <w:rPr/>
+      </w:r>
+    </w:p>
+    <w:p>
+      <w:pPr>
+        <w:pStyle w:val="Normal"/>
+        <w:bidi w:val="0"/>
+        <w:jc w:val="start"/>
+        <w:rPr/>
+      </w:pPr>
+      <w:r>
+        <w:rPr/>
+      </w:r>
+    </w:p>
+    <w:p>
+      <w:pPr>
+        <w:pStyle w:val="Normal"/>
+        <w:bidi w:val="0"/>
+        <w:jc w:val="start"/>
+        <w:rPr/>
+      </w:pPr>
+      <w:r>
+        <w:rPr/>
+      </w:r>
+    </w:p>
+    <w:p>
+      <w:pPr>
+        <w:pStyle w:val="Normal"/>
+        <w:bidi w:val="0"/>
+        <w:jc w:val="start"/>
+        <w:rPr/>
+      </w:pPr>
+      <w:r>
+        <w:rPr/>
+      </w:r>
+    </w:p>
+    <w:p>
+      <w:pPr>
+        <w:pStyle w:val="Normal"/>
+        <w:bidi w:val="0"/>
+        <w:jc w:val="start"/>
+        <w:rPr/>
+      </w:pPr>
+      <w:r>
+        <w:rPr/>
+        <w:drawing>
+          <wp:anchor behindDoc="0" distT="0" distB="0" distL="0" distR="0" simplePos="0" locked="0" layoutInCell="0" allowOverlap="1" relativeHeight="8">
+            <wp:simplePos x="0" y="0"/>
+            <wp:positionH relativeFrom="column">
+              <wp:posOffset>116840</wp:posOffset>
+            </wp:positionH>
+            <wp:positionV relativeFrom="paragraph">
+              <wp:posOffset>160020</wp:posOffset>
+            </wp:positionV>
+            <wp:extent cx="4086225" cy="2225675"/>
+            <wp:effectExtent l="0" t="0" r="0" b="0"/>
+            <wp:wrapSquare wrapText="largest"/>
+            <wp:docPr id="11" name="Image9" descr="" title=""/>
+            <wp:cNvGraphicFramePr>
+              <a:graphicFrameLocks xmlns:a="http://schemas.openxmlformats.org/drawingml/2006/main" noChangeAspect="1"/>
+            </wp:cNvGraphicFramePr>
+            <a:graphic xmlns:a="http://schemas.openxmlformats.org/drawingml/2006/main">
+              <a:graphicData uri="http://schemas.openxmlformats.org/drawingml/2006/picture">
+                <pic:pic xmlns:pic="http://schemas.openxmlformats.org/drawingml/2006/picture">
+                  <pic:nvPicPr>
+                    <pic:cNvPr id="11" name="Image9" descr="" title=""/>
+                    <pic:cNvPicPr>
+                      <a:picLocks noChangeAspect="1" noChangeArrowheads="1"/>
+                    </pic:cNvPicPr>
+                  </pic:nvPicPr>
+                  <pic:blipFill>
+                    <a:blip r:embed="rId12"/>
                     <a:stretch>
                       <a:fillRect/>
                     </a:stretch>
@@ -2315,19 +2615,42 @@
         <w:rPr/>
       </w:pPr>
       <w:r>
+        <w:rPr/>
+      </w:r>
+    </w:p>
+    <w:p>
+      <w:pPr>
+        <w:pStyle w:val="Normal"/>
+        <w:bidi w:val="0"/>
+        <w:jc w:val="start"/>
+        <w:rPr/>
+      </w:pPr>
+      <w:r>
+        <w:rPr/>
+      </w:r>
+    </w:p>
+    <w:p>
+      <w:pPr>
+        <w:pStyle w:val="Normal"/>
+        <w:bidi w:val="0"/>
+        <w:jc w:val="start"/>
+        <w:rPr/>
+      </w:pPr>
+      <w:r>
+        <w:rPr/>
         <w:drawing>
-          <wp:anchor behindDoc="0" distT="0" distB="0" distL="0" distR="0" simplePos="0" locked="0" layoutInCell="0" allowOverlap="1" relativeHeight="8">
+          <wp:anchor behindDoc="0" distT="0" distB="0" distL="0" distR="0" simplePos="0" locked="0" layoutInCell="0" allowOverlap="1" relativeHeight="14">
             <wp:simplePos x="0" y="0"/>
             <wp:positionH relativeFrom="column">
-              <wp:posOffset>50165</wp:posOffset>
+              <wp:align>center</wp:align>
             </wp:positionH>
             <wp:positionV relativeFrom="paragraph">
-              <wp:posOffset>391795</wp:posOffset>
+              <wp:posOffset>635</wp:posOffset>
             </wp:positionV>
-            <wp:extent cx="4117340" cy="2242820"/>
+            <wp:extent cx="6120130" cy="541655"/>
             <wp:effectExtent l="0" t="0" r="0" b="0"/>
             <wp:wrapSquare wrapText="largest"/>
-            <wp:docPr id="10" name="Image10" descr="" title=""/>
+            <wp:docPr id="12" name="Image13" descr="" title=""/>
             <wp:cNvGraphicFramePr>
               <a:graphicFrameLocks xmlns:a="http://schemas.openxmlformats.org/drawingml/2006/main" noChangeAspect="1"/>
             </wp:cNvGraphicFramePr>
@@ -2335,13 +2658,13 @@
               <a:graphicData uri="http://schemas.openxmlformats.org/drawingml/2006/picture">
                 <pic:pic xmlns:pic="http://schemas.openxmlformats.org/drawingml/2006/picture">
                   <pic:nvPicPr>
-                    <pic:cNvPr id="10" name="Image10" descr="" title=""/>
+                    <pic:cNvPr id="12" name="Image13" descr="" title=""/>
                     <pic:cNvPicPr>
                       <a:picLocks noChangeAspect="1" noChangeArrowheads="1"/>
                     </pic:cNvPicPr>
                   </pic:nvPicPr>
                   <pic:blipFill>
-                    <a:blip r:embed="rId11"/>
+                    <a:blip r:embed="rId13"/>
                     <a:stretch>
                       <a:fillRect/>
                     </a:stretch>
@@ -2349,7 +2672,7 @@
                   <pic:spPr bwMode="auto">
                     <a:xfrm>
                       <a:off x="0" y="0"/>
-                      <a:ext cx="4117340" cy="2242820"/>
+                      <a:ext cx="6120130" cy="541655"/>
                     </a:xfrm>
                     <a:prstGeom prst="rect">
                       <a:avLst/>
@@ -2361,9 +2684,929 @@
           </wp:anchor>
         </w:drawing>
       </w:r>
+    </w:p>
+    <w:p>
+      <w:pPr>
+        <w:pStyle w:val="Normal"/>
+        <w:bidi w:val="0"/>
+        <w:jc w:val="start"/>
+        <w:rPr/>
+      </w:pPr>
+      <w:r>
+        <w:rPr/>
+      </w:r>
+    </w:p>
+    <w:p>
+      <w:pPr>
+        <w:pStyle w:val="Normal"/>
+        <w:bidi w:val="0"/>
+        <w:jc w:val="start"/>
+        <w:rPr/>
+      </w:pPr>
+      <w:r>
+        <w:rPr/>
+      </w:r>
+    </w:p>
+    <w:p>
+      <w:pPr>
+        <w:pStyle w:val="Normal"/>
+        <w:bidi w:val="0"/>
+        <w:jc w:val="start"/>
+        <w:rPr/>
+      </w:pPr>
       <w:r>
         <w:rPr/>
         <w:t xml:space="preserve">Screenshot of the Application </w:t>
+      </w:r>
+    </w:p>
+    <w:p>
+      <w:pPr>
+        <w:pStyle w:val="Normal"/>
+        <w:bidi w:val="0"/>
+        <w:jc w:val="start"/>
+        <w:rPr/>
+      </w:pPr>
+      <w:r>
+        <w:rPr/>
+        <w:drawing>
+          <wp:anchor behindDoc="0" distT="0" distB="0" distL="0" distR="0" simplePos="0" locked="0" layoutInCell="0" allowOverlap="1" relativeHeight="13">
+            <wp:simplePos x="0" y="0"/>
+            <wp:positionH relativeFrom="column">
+              <wp:posOffset>-1270</wp:posOffset>
+            </wp:positionH>
+            <wp:positionV relativeFrom="paragraph">
+              <wp:posOffset>137795</wp:posOffset>
+            </wp:positionV>
+            <wp:extent cx="4725035" cy="2573655"/>
+            <wp:effectExtent l="0" t="0" r="0" b="0"/>
+            <wp:wrapSquare wrapText="largest"/>
+            <wp:docPr id="13" name="Image10" descr="" title=""/>
+            <wp:cNvGraphicFramePr>
+              <a:graphicFrameLocks xmlns:a="http://schemas.openxmlformats.org/drawingml/2006/main" noChangeAspect="1"/>
+            </wp:cNvGraphicFramePr>
+            <a:graphic xmlns:a="http://schemas.openxmlformats.org/drawingml/2006/main">
+              <a:graphicData uri="http://schemas.openxmlformats.org/drawingml/2006/picture">
+                <pic:pic xmlns:pic="http://schemas.openxmlformats.org/drawingml/2006/picture">
+                  <pic:nvPicPr>
+                    <pic:cNvPr id="13" name="Image10" descr="" title=""/>
+                    <pic:cNvPicPr>
+                      <a:picLocks noChangeAspect="1" noChangeArrowheads="1"/>
+                    </pic:cNvPicPr>
+                  </pic:nvPicPr>
+                  <pic:blipFill>
+                    <a:blip r:embed="rId14"/>
+                    <a:stretch>
+                      <a:fillRect/>
+                    </a:stretch>
+                  </pic:blipFill>
+                  <pic:spPr bwMode="auto">
+                    <a:xfrm>
+                      <a:off x="0" y="0"/>
+                      <a:ext cx="4725035" cy="2573655"/>
+                    </a:xfrm>
+                    <a:prstGeom prst="rect">
+                      <a:avLst/>
+                    </a:prstGeom>
+                  </pic:spPr>
+                </pic:pic>
+              </a:graphicData>
+            </a:graphic>
+          </wp:anchor>
+        </w:drawing>
+      </w:r>
+    </w:p>
+    <w:p>
+      <w:pPr>
+        <w:pStyle w:val="Normal"/>
+        <w:bidi w:val="0"/>
+        <w:jc w:val="start"/>
+        <w:rPr/>
+      </w:pPr>
+      <w:r>
+        <w:rPr/>
+      </w:r>
+    </w:p>
+    <w:p>
+      <w:pPr>
+        <w:pStyle w:val="Normal"/>
+        <w:bidi w:val="0"/>
+        <w:jc w:val="start"/>
+        <w:rPr/>
+      </w:pPr>
+      <w:r>
+        <w:rPr/>
+      </w:r>
+    </w:p>
+    <w:p>
+      <w:pPr>
+        <w:pStyle w:val="Normal"/>
+        <w:bidi w:val="0"/>
+        <w:jc w:val="start"/>
+        <w:rPr/>
+      </w:pPr>
+      <w:r>
+        <w:rPr/>
+      </w:r>
+    </w:p>
+    <w:p>
+      <w:pPr>
+        <w:pStyle w:val="Normal"/>
+        <w:bidi w:val="0"/>
+        <w:jc w:val="start"/>
+        <w:rPr/>
+      </w:pPr>
+      <w:r>
+        <w:rPr/>
+      </w:r>
+    </w:p>
+    <w:p>
+      <w:pPr>
+        <w:pStyle w:val="Normal"/>
+        <w:bidi w:val="0"/>
+        <w:jc w:val="start"/>
+        <w:rPr/>
+      </w:pPr>
+      <w:r>
+        <w:rPr/>
+      </w:r>
+    </w:p>
+    <w:p>
+      <w:pPr>
+        <w:pStyle w:val="Normal"/>
+        <w:bidi w:val="0"/>
+        <w:jc w:val="start"/>
+        <w:rPr/>
+      </w:pPr>
+      <w:r>
+        <w:rPr/>
+      </w:r>
+    </w:p>
+    <w:p>
+      <w:pPr>
+        <w:pStyle w:val="Normal"/>
+        <w:bidi w:val="0"/>
+        <w:jc w:val="start"/>
+        <w:rPr/>
+      </w:pPr>
+      <w:r>
+        <w:rPr/>
+      </w:r>
+    </w:p>
+    <w:p>
+      <w:pPr>
+        <w:pStyle w:val="Normal"/>
+        <w:bidi w:val="0"/>
+        <w:jc w:val="start"/>
+        <w:rPr/>
+      </w:pPr>
+      <w:r>
+        <w:rPr/>
+      </w:r>
+    </w:p>
+    <w:p>
+      <w:pPr>
+        <w:pStyle w:val="Normal"/>
+        <w:bidi w:val="0"/>
+        <w:jc w:val="start"/>
+        <w:rPr/>
+      </w:pPr>
+      <w:r>
+        <w:rPr/>
+      </w:r>
+    </w:p>
+    <w:p>
+      <w:pPr>
+        <w:pStyle w:val="Normal"/>
+        <w:bidi w:val="0"/>
+        <w:jc w:val="start"/>
+        <w:rPr/>
+      </w:pPr>
+      <w:r>
+        <w:rPr/>
+      </w:r>
+    </w:p>
+    <w:p>
+      <w:pPr>
+        <w:pStyle w:val="Normal"/>
+        <w:bidi w:val="0"/>
+        <w:jc w:val="start"/>
+        <w:rPr/>
+      </w:pPr>
+      <w:r>
+        <w:rPr/>
+      </w:r>
+    </w:p>
+    <w:p>
+      <w:pPr>
+        <w:pStyle w:val="Normal"/>
+        <w:bidi w:val="0"/>
+        <w:jc w:val="start"/>
+        <w:rPr/>
+      </w:pPr>
+      <w:r>
+        <w:rPr/>
+      </w:r>
+    </w:p>
+    <w:p>
+      <w:pPr>
+        <w:pStyle w:val="Normal"/>
+        <w:bidi w:val="0"/>
+        <w:jc w:val="start"/>
+        <w:rPr/>
+      </w:pPr>
+      <w:r>
+        <w:rPr/>
+      </w:r>
+    </w:p>
+    <w:p>
+      <w:pPr>
+        <w:pStyle w:val="Normal"/>
+        <w:bidi w:val="0"/>
+        <w:jc w:val="start"/>
+        <w:rPr/>
+      </w:pPr>
+      <w:r>
+        <w:rPr/>
+      </w:r>
+    </w:p>
+    <w:p>
+      <w:pPr>
+        <w:pStyle w:val="Normal"/>
+        <w:bidi w:val="0"/>
+        <w:jc w:val="start"/>
+        <w:rPr/>
+      </w:pPr>
+      <w:r>
+        <w:rPr/>
+      </w:r>
+    </w:p>
+    <w:p>
+      <w:pPr>
+        <w:pStyle w:val="Normal"/>
+        <w:bidi w:val="0"/>
+        <w:jc w:val="start"/>
+        <w:rPr/>
+      </w:pPr>
+      <w:r>
+        <w:rPr/>
+      </w:r>
+    </w:p>
+    <w:p>
+      <w:pPr>
+        <w:pStyle w:val="Normal"/>
+        <w:bidi w:val="0"/>
+        <w:jc w:val="start"/>
+        <w:rPr/>
+      </w:pPr>
+      <w:r>
+        <w:rPr/>
+      </w:r>
+    </w:p>
+    <w:p>
+      <w:pPr>
+        <w:pStyle w:val="Normal"/>
+        <w:bidi w:val="0"/>
+        <w:jc w:val="start"/>
+        <w:rPr/>
+      </w:pPr>
+      <w:r>
+        <w:rPr/>
+        <w:t>Monitoring the Cluster and the  Prometheus and Grafana Outputs</w:t>
+      </w:r>
+    </w:p>
+    <w:p>
+      <w:pPr>
+        <w:pStyle w:val="Normal"/>
+        <w:bidi w:val="0"/>
+        <w:jc w:val="start"/>
+        <w:rPr/>
+      </w:pPr>
+      <w:r>
+        <w:rPr/>
+      </w:r>
+    </w:p>
+    <w:p>
+      <w:pPr>
+        <w:pStyle w:val="Normal"/>
+        <w:bidi w:val="0"/>
+        <w:jc w:val="start"/>
+        <w:rPr/>
+      </w:pPr>
+      <w:r>
+        <w:rPr/>
+        <w:drawing>
+          <wp:anchor behindDoc="0" distT="0" distB="0" distL="0" distR="0" simplePos="0" locked="0" layoutInCell="0" allowOverlap="1" relativeHeight="15">
+            <wp:simplePos x="0" y="0"/>
+            <wp:positionH relativeFrom="column">
+              <wp:posOffset>51435</wp:posOffset>
+            </wp:positionH>
+            <wp:positionV relativeFrom="paragraph">
+              <wp:posOffset>28575</wp:posOffset>
+            </wp:positionV>
+            <wp:extent cx="6120130" cy="3321685"/>
+            <wp:effectExtent l="0" t="0" r="0" b="0"/>
+            <wp:wrapSquare wrapText="largest"/>
+            <wp:docPr id="14" name="Image14" descr="" title=""/>
+            <wp:cNvGraphicFramePr>
+              <a:graphicFrameLocks xmlns:a="http://schemas.openxmlformats.org/drawingml/2006/main" noChangeAspect="1"/>
+            </wp:cNvGraphicFramePr>
+            <a:graphic xmlns:a="http://schemas.openxmlformats.org/drawingml/2006/main">
+              <a:graphicData uri="http://schemas.openxmlformats.org/drawingml/2006/picture">
+                <pic:pic xmlns:pic="http://schemas.openxmlformats.org/drawingml/2006/picture">
+                  <pic:nvPicPr>
+                    <pic:cNvPr id="14" name="Image14" descr="" title=""/>
+                    <pic:cNvPicPr>
+                      <a:picLocks noChangeAspect="1" noChangeArrowheads="1"/>
+                    </pic:cNvPicPr>
+                  </pic:nvPicPr>
+                  <pic:blipFill>
+                    <a:blip r:embed="rId15"/>
+                    <a:stretch>
+                      <a:fillRect/>
+                    </a:stretch>
+                  </pic:blipFill>
+                  <pic:spPr bwMode="auto">
+                    <a:xfrm>
+                      <a:off x="0" y="0"/>
+                      <a:ext cx="6120130" cy="3321685"/>
+                    </a:xfrm>
+                    <a:prstGeom prst="rect">
+                      <a:avLst/>
+                    </a:prstGeom>
+                  </pic:spPr>
+                </pic:pic>
+              </a:graphicData>
+            </a:graphic>
+          </wp:anchor>
+        </w:drawing>
+      </w:r>
+    </w:p>
+    <w:p>
+      <w:pPr>
+        <w:pStyle w:val="Normal"/>
+        <w:bidi w:val="0"/>
+        <w:jc w:val="start"/>
+        <w:rPr/>
+      </w:pPr>
+      <w:r>
+        <w:rPr/>
+      </w:r>
+    </w:p>
+    <w:p>
+      <w:pPr>
+        <w:pStyle w:val="Normal"/>
+        <w:bidi w:val="0"/>
+        <w:jc w:val="start"/>
+        <w:rPr/>
+      </w:pPr>
+      <w:r>
+        <w:rPr/>
+      </w:r>
+    </w:p>
+    <w:p>
+      <w:pPr>
+        <w:pStyle w:val="Normal"/>
+        <w:bidi w:val="0"/>
+        <w:jc w:val="start"/>
+        <w:rPr/>
+      </w:pPr>
+      <w:r>
+        <w:rPr/>
+      </w:r>
+    </w:p>
+    <w:p>
+      <w:pPr>
+        <w:pStyle w:val="Normal"/>
+        <w:bidi w:val="0"/>
+        <w:jc w:val="start"/>
+        <w:rPr/>
+      </w:pPr>
+      <w:r>
+        <w:rPr/>
+      </w:r>
+    </w:p>
+    <w:p>
+      <w:pPr>
+        <w:pStyle w:val="Normal"/>
+        <w:bidi w:val="0"/>
+        <w:jc w:val="start"/>
+        <w:rPr/>
+      </w:pPr>
+      <w:r>
+        <w:rPr/>
+      </w:r>
+    </w:p>
+    <w:p>
+      <w:pPr>
+        <w:pStyle w:val="Normal"/>
+        <w:bidi w:val="0"/>
+        <w:jc w:val="start"/>
+        <w:rPr/>
+      </w:pPr>
+      <w:r>
+        <w:rPr/>
+      </w:r>
+    </w:p>
+    <w:p>
+      <w:pPr>
+        <w:pStyle w:val="Normal"/>
+        <w:bidi w:val="0"/>
+        <w:jc w:val="start"/>
+        <w:rPr/>
+      </w:pPr>
+      <w:r>
+        <w:rPr/>
+      </w:r>
+    </w:p>
+    <w:p>
+      <w:pPr>
+        <w:pStyle w:val="Normal"/>
+        <w:bidi w:val="0"/>
+        <w:jc w:val="start"/>
+        <w:rPr/>
+      </w:pPr>
+      <w:r>
+        <w:rPr/>
+      </w:r>
+    </w:p>
+    <w:p>
+      <w:pPr>
+        <w:pStyle w:val="Normal"/>
+        <w:bidi w:val="0"/>
+        <w:jc w:val="start"/>
+        <w:rPr/>
+      </w:pPr>
+      <w:r>
+        <w:rPr/>
+        <w:drawing>
+          <wp:anchor behindDoc="0" distT="0" distB="0" distL="0" distR="0" simplePos="0" locked="0" layoutInCell="0" allowOverlap="1" relativeHeight="19">
+            <wp:simplePos x="0" y="0"/>
+            <wp:positionH relativeFrom="column">
+              <wp:align>center</wp:align>
+            </wp:positionH>
+            <wp:positionV relativeFrom="paragraph">
+              <wp:posOffset>635</wp:posOffset>
+            </wp:positionV>
+            <wp:extent cx="6120130" cy="3321685"/>
+            <wp:effectExtent l="0" t="0" r="0" b="0"/>
+            <wp:wrapSquare wrapText="largest"/>
+            <wp:docPr id="15" name="Image15" descr="" title=""/>
+            <wp:cNvGraphicFramePr>
+              <a:graphicFrameLocks xmlns:a="http://schemas.openxmlformats.org/drawingml/2006/main" noChangeAspect="1"/>
+            </wp:cNvGraphicFramePr>
+            <a:graphic xmlns:a="http://schemas.openxmlformats.org/drawingml/2006/main">
+              <a:graphicData uri="http://schemas.openxmlformats.org/drawingml/2006/picture">
+                <pic:pic xmlns:pic="http://schemas.openxmlformats.org/drawingml/2006/picture">
+                  <pic:nvPicPr>
+                    <pic:cNvPr id="15" name="Image15" descr="" title=""/>
+                    <pic:cNvPicPr>
+                      <a:picLocks noChangeAspect="1" noChangeArrowheads="1"/>
+                    </pic:cNvPicPr>
+                  </pic:nvPicPr>
+                  <pic:blipFill>
+                    <a:blip r:embed="rId16"/>
+                    <a:stretch>
+                      <a:fillRect/>
+                    </a:stretch>
+                  </pic:blipFill>
+                  <pic:spPr bwMode="auto">
+                    <a:xfrm>
+                      <a:off x="0" y="0"/>
+                      <a:ext cx="6120130" cy="3321685"/>
+                    </a:xfrm>
+                    <a:prstGeom prst="rect">
+                      <a:avLst/>
+                    </a:prstGeom>
+                  </pic:spPr>
+                </pic:pic>
+              </a:graphicData>
+            </a:graphic>
+          </wp:anchor>
+        </w:drawing>
+      </w:r>
+    </w:p>
+    <w:p>
+      <w:pPr>
+        <w:pStyle w:val="Normal"/>
+        <w:bidi w:val="0"/>
+        <w:jc w:val="start"/>
+        <w:rPr/>
+      </w:pPr>
+      <w:r>
+        <w:rPr/>
+      </w:r>
+    </w:p>
+    <w:p>
+      <w:pPr>
+        <w:pStyle w:val="Normal"/>
+        <w:bidi w:val="0"/>
+        <w:jc w:val="start"/>
+        <w:rPr/>
+      </w:pPr>
+      <w:r>
+        <w:rPr/>
+        <w:t>Below are the screenshot for the terraform commands and its output</w:t>
+      </w:r>
+    </w:p>
+    <w:p>
+      <w:pPr>
+        <w:pStyle w:val="Normal"/>
+        <w:bidi w:val="0"/>
+        <w:jc w:val="start"/>
+        <w:rPr/>
+      </w:pPr>
+      <w:r>
+        <w:rPr/>
+        <w:drawing>
+          <wp:anchor behindDoc="0" distT="0" distB="0" distL="0" distR="0" simplePos="0" locked="0" layoutInCell="0" allowOverlap="1" relativeHeight="16">
+            <wp:simplePos x="0" y="0"/>
+            <wp:positionH relativeFrom="column">
+              <wp:posOffset>0</wp:posOffset>
+            </wp:positionH>
+            <wp:positionV relativeFrom="paragraph">
+              <wp:posOffset>34925</wp:posOffset>
+            </wp:positionV>
+            <wp:extent cx="6120130" cy="3321685"/>
+            <wp:effectExtent l="0" t="0" r="0" b="0"/>
+            <wp:wrapSquare wrapText="largest"/>
+            <wp:docPr id="16" name="Image16" descr="" title=""/>
+            <wp:cNvGraphicFramePr>
+              <a:graphicFrameLocks xmlns:a="http://schemas.openxmlformats.org/drawingml/2006/main" noChangeAspect="1"/>
+            </wp:cNvGraphicFramePr>
+            <a:graphic xmlns:a="http://schemas.openxmlformats.org/drawingml/2006/main">
+              <a:graphicData uri="http://schemas.openxmlformats.org/drawingml/2006/picture">
+                <pic:pic xmlns:pic="http://schemas.openxmlformats.org/drawingml/2006/picture">
+                  <pic:nvPicPr>
+                    <pic:cNvPr id="16" name="Image16" descr="" title=""/>
+                    <pic:cNvPicPr>
+                      <a:picLocks noChangeAspect="1" noChangeArrowheads="1"/>
+                    </pic:cNvPicPr>
+                  </pic:nvPicPr>
+                  <pic:blipFill>
+                    <a:blip r:embed="rId17"/>
+                    <a:stretch>
+                      <a:fillRect/>
+                    </a:stretch>
+                  </pic:blipFill>
+                  <pic:spPr bwMode="auto">
+                    <a:xfrm>
+                      <a:off x="0" y="0"/>
+                      <a:ext cx="6120130" cy="3321685"/>
+                    </a:xfrm>
+                    <a:prstGeom prst="rect">
+                      <a:avLst/>
+                    </a:prstGeom>
+                  </pic:spPr>
+                </pic:pic>
+              </a:graphicData>
+            </a:graphic>
+          </wp:anchor>
+        </w:drawing>
+      </w:r>
+    </w:p>
+    <w:p>
+      <w:pPr>
+        <w:pStyle w:val="Normal"/>
+        <w:bidi w:val="0"/>
+        <w:jc w:val="start"/>
+        <w:rPr/>
+      </w:pPr>
+      <w:r>
+        <w:rPr/>
+      </w:r>
+    </w:p>
+    <w:p>
+      <w:pPr>
+        <w:pStyle w:val="Normal"/>
+        <w:bidi w:val="0"/>
+        <w:jc w:val="start"/>
+        <w:rPr/>
+      </w:pPr>
+      <w:r>
+        <w:rPr/>
+      </w:r>
+    </w:p>
+    <w:p>
+      <w:pPr>
+        <w:pStyle w:val="Normal"/>
+        <w:bidi w:val="0"/>
+        <w:jc w:val="start"/>
+        <w:rPr/>
+      </w:pPr>
+      <w:r>
+        <w:rPr/>
+      </w:r>
+    </w:p>
+    <w:p>
+      <w:pPr>
+        <w:pStyle w:val="Normal"/>
+        <w:bidi w:val="0"/>
+        <w:jc w:val="start"/>
+        <w:rPr/>
+      </w:pPr>
+      <w:r>
+        <w:rPr/>
+      </w:r>
+    </w:p>
+    <w:p>
+      <w:pPr>
+        <w:pStyle w:val="Normal"/>
+        <w:bidi w:val="0"/>
+        <w:jc w:val="start"/>
+        <w:rPr/>
+      </w:pPr>
+      <w:r>
+        <w:rPr/>
+      </w:r>
+    </w:p>
+    <w:p>
+      <w:pPr>
+        <w:pStyle w:val="Normal"/>
+        <w:bidi w:val="0"/>
+        <w:jc w:val="start"/>
+        <w:rPr/>
+      </w:pPr>
+      <w:r>
+        <w:rPr/>
+      </w:r>
+    </w:p>
+    <w:p>
+      <w:pPr>
+        <w:pStyle w:val="Normal"/>
+        <w:bidi w:val="0"/>
+        <w:jc w:val="start"/>
+        <w:rPr/>
+      </w:pPr>
+      <w:r>
+        <w:rPr/>
+      </w:r>
+    </w:p>
+    <w:p>
+      <w:pPr>
+        <w:pStyle w:val="Normal"/>
+        <w:bidi w:val="0"/>
+        <w:jc w:val="start"/>
+        <w:rPr/>
+      </w:pPr>
+      <w:r>
+        <w:rPr/>
+      </w:r>
+    </w:p>
+    <w:p>
+      <w:pPr>
+        <w:pStyle w:val="Normal"/>
+        <w:bidi w:val="0"/>
+        <w:jc w:val="start"/>
+        <w:rPr/>
+      </w:pPr>
+      <w:r>
+        <w:rPr/>
+        <w:drawing>
+          <wp:anchor behindDoc="0" distT="0" distB="0" distL="0" distR="0" simplePos="0" locked="0" layoutInCell="0" allowOverlap="1" relativeHeight="17">
+            <wp:simplePos x="0" y="0"/>
+            <wp:positionH relativeFrom="column">
+              <wp:posOffset>36830</wp:posOffset>
+            </wp:positionH>
+            <wp:positionV relativeFrom="paragraph">
+              <wp:posOffset>60960</wp:posOffset>
+            </wp:positionV>
+            <wp:extent cx="6120130" cy="3321685"/>
+            <wp:effectExtent l="0" t="0" r="0" b="0"/>
+            <wp:wrapSquare wrapText="largest"/>
+            <wp:docPr id="17" name="Image17" descr="" title=""/>
+            <wp:cNvGraphicFramePr>
+              <a:graphicFrameLocks xmlns:a="http://schemas.openxmlformats.org/drawingml/2006/main" noChangeAspect="1"/>
+            </wp:cNvGraphicFramePr>
+            <a:graphic xmlns:a="http://schemas.openxmlformats.org/drawingml/2006/main">
+              <a:graphicData uri="http://schemas.openxmlformats.org/drawingml/2006/picture">
+                <pic:pic xmlns:pic="http://schemas.openxmlformats.org/drawingml/2006/picture">
+                  <pic:nvPicPr>
+                    <pic:cNvPr id="17" name="Image17" descr="" title=""/>
+                    <pic:cNvPicPr>
+                      <a:picLocks noChangeAspect="1" noChangeArrowheads="1"/>
+                    </pic:cNvPicPr>
+                  </pic:nvPicPr>
+                  <pic:blipFill>
+                    <a:blip r:embed="rId18"/>
+                    <a:stretch>
+                      <a:fillRect/>
+                    </a:stretch>
+                  </pic:blipFill>
+                  <pic:spPr bwMode="auto">
+                    <a:xfrm>
+                      <a:off x="0" y="0"/>
+                      <a:ext cx="6120130" cy="3321685"/>
+                    </a:xfrm>
+                    <a:prstGeom prst="rect">
+                      <a:avLst/>
+                    </a:prstGeom>
+                  </pic:spPr>
+                </pic:pic>
+              </a:graphicData>
+            </a:graphic>
+          </wp:anchor>
+        </w:drawing>
+      </w:r>
+    </w:p>
+    <w:p>
+      <w:pPr>
+        <w:pStyle w:val="Normal"/>
+        <w:bidi w:val="0"/>
+        <w:jc w:val="start"/>
+        <w:rPr/>
+      </w:pPr>
+      <w:r>
+        <w:rPr/>
+      </w:r>
+    </w:p>
+    <w:p>
+      <w:pPr>
+        <w:pStyle w:val="Normal"/>
+        <w:bidi w:val="0"/>
+        <w:jc w:val="start"/>
+        <w:rPr/>
+      </w:pPr>
+      <w:r>
+        <w:rPr/>
+      </w:r>
+    </w:p>
+    <w:p>
+      <w:pPr>
+        <w:pStyle w:val="Normal"/>
+        <w:bidi w:val="0"/>
+        <w:jc w:val="start"/>
+        <w:rPr/>
+      </w:pPr>
+      <w:r>
+        <w:rPr/>
+      </w:r>
+    </w:p>
+    <w:p>
+      <w:pPr>
+        <w:pStyle w:val="Normal"/>
+        <w:bidi w:val="0"/>
+        <w:jc w:val="start"/>
+        <w:rPr/>
+      </w:pPr>
+      <w:r>
+        <w:rPr/>
+        <w:drawing>
+          <wp:anchor behindDoc="0" distT="0" distB="0" distL="0" distR="0" simplePos="0" locked="0" layoutInCell="0" allowOverlap="1" relativeHeight="18">
+            <wp:simplePos x="0" y="0"/>
+            <wp:positionH relativeFrom="column">
+              <wp:posOffset>-58420</wp:posOffset>
+            </wp:positionH>
+            <wp:positionV relativeFrom="paragraph">
+              <wp:posOffset>62230</wp:posOffset>
+            </wp:positionV>
+            <wp:extent cx="6120130" cy="3321685"/>
+            <wp:effectExtent l="0" t="0" r="0" b="0"/>
+            <wp:wrapSquare wrapText="largest"/>
+            <wp:docPr id="18" name="Image18" descr="" title=""/>
+            <wp:cNvGraphicFramePr>
+              <a:graphicFrameLocks xmlns:a="http://schemas.openxmlformats.org/drawingml/2006/main" noChangeAspect="1"/>
+            </wp:cNvGraphicFramePr>
+            <a:graphic xmlns:a="http://schemas.openxmlformats.org/drawingml/2006/main">
+              <a:graphicData uri="http://schemas.openxmlformats.org/drawingml/2006/picture">
+                <pic:pic xmlns:pic="http://schemas.openxmlformats.org/drawingml/2006/picture">
+                  <pic:nvPicPr>
+                    <pic:cNvPr id="18" name="Image18" descr="" title=""/>
+                    <pic:cNvPicPr>
+                      <a:picLocks noChangeAspect="1" noChangeArrowheads="1"/>
+                    </pic:cNvPicPr>
+                  </pic:nvPicPr>
+                  <pic:blipFill>
+                    <a:blip r:embed="rId19"/>
+                    <a:stretch>
+                      <a:fillRect/>
+                    </a:stretch>
+                  </pic:blipFill>
+                  <pic:spPr bwMode="auto">
+                    <a:xfrm>
+                      <a:off x="0" y="0"/>
+                      <a:ext cx="6120130" cy="3321685"/>
+                    </a:xfrm>
+                    <a:prstGeom prst="rect">
+                      <a:avLst/>
+                    </a:prstGeom>
+                  </pic:spPr>
+                </pic:pic>
+              </a:graphicData>
+            </a:graphic>
+          </wp:anchor>
+        </w:drawing>
+      </w:r>
+    </w:p>
+    <w:p>
+      <w:pPr>
+        <w:pStyle w:val="Normal"/>
+        <w:bidi w:val="0"/>
+        <w:jc w:val="start"/>
+        <w:rPr/>
+      </w:pPr>
+      <w:r>
+        <w:rPr/>
+      </w:r>
+    </w:p>
+    <w:p>
+      <w:pPr>
+        <w:pStyle w:val="Normal"/>
+        <w:bidi w:val="0"/>
+        <w:jc w:val="start"/>
+        <w:rPr/>
+      </w:pPr>
+      <w:r>
+        <w:rPr/>
+      </w:r>
+    </w:p>
+    <w:p>
+      <w:pPr>
+        <w:pStyle w:val="Normal"/>
+        <w:bidi w:val="0"/>
+        <w:jc w:val="start"/>
+        <w:rPr/>
+      </w:pPr>
+      <w:r>
+        <w:rPr/>
+      </w:r>
+    </w:p>
+    <w:p>
+      <w:pPr>
+        <w:pStyle w:val="Normal"/>
+        <w:bidi w:val="0"/>
+        <w:jc w:val="start"/>
+        <w:rPr/>
+      </w:pPr>
+      <w:r>
+        <w:rPr/>
+        <w:drawing>
+          <wp:anchor behindDoc="0" distT="0" distB="0" distL="0" distR="0" simplePos="0" locked="0" layoutInCell="0" allowOverlap="1" relativeHeight="20">
+            <wp:simplePos x="0" y="0"/>
+            <wp:positionH relativeFrom="column">
+              <wp:posOffset>36195</wp:posOffset>
+            </wp:positionH>
+            <wp:positionV relativeFrom="paragraph">
+              <wp:posOffset>644525</wp:posOffset>
+            </wp:positionV>
+            <wp:extent cx="6120130" cy="3321685"/>
+            <wp:effectExtent l="0" t="0" r="0" b="0"/>
+            <wp:wrapSquare wrapText="largest"/>
+            <wp:docPr id="19" name="Image19" descr="" title=""/>
+            <wp:cNvGraphicFramePr>
+              <a:graphicFrameLocks xmlns:a="http://schemas.openxmlformats.org/drawingml/2006/main" noChangeAspect="1"/>
+            </wp:cNvGraphicFramePr>
+            <a:graphic xmlns:a="http://schemas.openxmlformats.org/drawingml/2006/main">
+              <a:graphicData uri="http://schemas.openxmlformats.org/drawingml/2006/picture">
+                <pic:pic xmlns:pic="http://schemas.openxmlformats.org/drawingml/2006/picture">
+                  <pic:nvPicPr>
+                    <pic:cNvPr id="19" name="Image19" descr="" title=""/>
+                    <pic:cNvPicPr>
+                      <a:picLocks noChangeAspect="1" noChangeArrowheads="1"/>
+                    </pic:cNvPicPr>
+                  </pic:nvPicPr>
+                  <pic:blipFill>
+                    <a:blip r:embed="rId20"/>
+                    <a:stretch>
+                      <a:fillRect/>
+                    </a:stretch>
+                  </pic:blipFill>
+                  <pic:spPr bwMode="auto">
+                    <a:xfrm>
+                      <a:off x="0" y="0"/>
+                      <a:ext cx="6120130" cy="3321685"/>
+                    </a:xfrm>
+                    <a:prstGeom prst="rect">
+                      <a:avLst/>
+                    </a:prstGeom>
+                  </pic:spPr>
+                </pic:pic>
+              </a:graphicData>
+            </a:graphic>
+          </wp:anchor>
+        </w:drawing>
+      </w:r>
+    </w:p>
+    <w:p>
+      <w:pPr>
+        <w:pStyle w:val="Normal"/>
+        <w:bidi w:val="0"/>
+        <w:jc w:val="start"/>
+        <w:rPr/>
+      </w:pPr>
+      <w:r>
+        <w:rPr/>
+      </w:r>
+    </w:p>
+    <w:p>
+      <w:pPr>
+        <w:pStyle w:val="Normal"/>
+        <w:bidi w:val="0"/>
+        <w:jc w:val="start"/>
+        <w:rPr/>
+      </w:pPr>
+      <w:r>
+        <w:rPr/>
+        <w:t>Jenkins-Servers details</w:t>
       </w:r>
     </w:p>
     <w:sectPr>

</xml_diff>